<commit_message>
feat: update DFD models and remove obsolete files
</commit_message>
<xml_diff>
--- a/apps/bff/templates/dfd_models/DAF-COF/model.docx
+++ b/apps/bff/templates/dfd_models/DAF-COF/model.docx
@@ -21,7 +21,7 @@
       <w:footerReference w:type="default" r:id="rId3"/>
       <w:type w:val="nextPage"/>
       <w:pgSz w:w="11906" w:h="16838"/>
-      <w:pgMar w:left="1701" w:right="1134" w:gutter="0" w:header="0" w:top="4043" w:footer="0" w:bottom="1985"/>
+      <w:pgMar w:left="1701" w:right="1134" w:gutter="0" w:header="0" w:top="3402" w:footer="0" w:bottom="1134"/>
       <w:pgNumType w:fmt="decimal"/>
       <w:formProt w:val="false"/>
       <w:textDirection w:val="lrTb"/>
@@ -645,9 +645,9 @@
             </w:rPr>
             <w:drawing>
               <wp:inline distT="0" distB="0" distL="0" distR="0">
-                <wp:extent cx="3634740" cy="845820"/>
+                <wp:extent cx="4090035" cy="761365"/>
                 <wp:effectExtent l="0" t="0" r="0" b="0"/>
-                <wp:docPr id="1" name="Imagem 6" descr="" title=""/>
+                <wp:docPr id="1" name="Imagem 2" descr="" title=""/>
                 <wp:cNvGraphicFramePr>
                   <a:graphicFrameLocks xmlns:a="http://schemas.openxmlformats.org/drawingml/2006/main" noChangeAspect="1"/>
                 </wp:cNvGraphicFramePr>
@@ -655,14 +655,14 @@
                   <a:graphicData uri="http://schemas.openxmlformats.org/drawingml/2006/picture">
                     <pic:pic xmlns:pic="http://schemas.openxmlformats.org/drawingml/2006/picture">
                       <pic:nvPicPr>
-                        <pic:cNvPr id="1" name="Imagem 6" descr="" title=""/>
+                        <pic:cNvPr id="1" name="Imagem 2" descr="" title=""/>
                         <pic:cNvPicPr>
                           <a:picLocks noChangeAspect="1" noChangeArrowheads="1"/>
                         </pic:cNvPicPr>
                       </pic:nvPicPr>
                       <pic:blipFill>
                         <a:blip r:embed="rId1"/>
-                        <a:srcRect l="-10" t="-42" r="-10" b="-42"/>
+                        <a:srcRect l="-9" t="-47" r="-9" b="-47"/>
                         <a:stretch>
                           <a:fillRect/>
                         </a:stretch>
@@ -670,7 +670,7 @@
                       <pic:spPr bwMode="auto">
                         <a:xfrm>
                           <a:off x="0" y="0"/>
-                          <a:ext cx="3634740" cy="845820"/>
+                          <a:ext cx="4090035" cy="761365"/>
                         </a:xfrm>
                         <a:prstGeom prst="rect">
                           <a:avLst/>
@@ -793,8 +793,8 @@
       </w:tblCellMar>
     </w:tblPr>
     <w:tblGrid>
-      <w:gridCol w:w="2224"/>
-      <w:gridCol w:w="7063"/>
+      <w:gridCol w:w="2220"/>
+      <w:gridCol w:w="7067"/>
     </w:tblGrid>
     <w:tr>
       <w:trPr>
@@ -802,7 +802,7 @@
       </w:trPr>
       <w:tc>
         <w:tcPr>
-          <w:tcW w:w="2224" w:type="dxa"/>
+          <w:tcW w:w="2220" w:type="dxa"/>
           <w:tcBorders>
             <w:top w:val="single" w:sz="4" w:space="0" w:color="000000"/>
             <w:start w:val="single" w:sz="4" w:space="0" w:color="FFFFFF"/>
@@ -825,9 +825,9 @@
             </w:rPr>
             <w:drawing>
               <wp:inline distT="0" distB="0" distL="0" distR="0">
-                <wp:extent cx="1275080" cy="687070"/>
+                <wp:extent cx="1271905" cy="689610"/>
                 <wp:effectExtent l="0" t="0" r="0" b="0"/>
-                <wp:docPr id="2" name="Figura1" descr="" title=""/>
+                <wp:docPr id="2" name="Imagem 6" descr="" title=""/>
                 <wp:cNvGraphicFramePr>
                   <a:graphicFrameLocks xmlns:a="http://schemas.openxmlformats.org/drawingml/2006/main" noChangeAspect="1"/>
                 </wp:cNvGraphicFramePr>
@@ -835,7 +835,7 @@
                   <a:graphicData uri="http://schemas.openxmlformats.org/drawingml/2006/picture">
                     <pic:pic xmlns:pic="http://schemas.openxmlformats.org/drawingml/2006/picture">
                       <pic:nvPicPr>
-                        <pic:cNvPr id="2" name="Figura1" descr="" title=""/>
+                        <pic:cNvPr id="2" name="Imagem 6" descr="" title=""/>
                         <pic:cNvPicPr>
                           <a:picLocks noChangeAspect="1" noChangeArrowheads="1"/>
                         </pic:cNvPicPr>
@@ -850,7 +850,7 @@
                       <pic:spPr bwMode="auto">
                         <a:xfrm>
                           <a:off x="0" y="0"/>
-                          <a:ext cx="1275080" cy="687070"/>
+                          <a:ext cx="1271905" cy="689610"/>
                         </a:xfrm>
                         <a:prstGeom prst="rect">
                           <a:avLst/>
@@ -866,7 +866,7 @@
       </w:tc>
       <w:tc>
         <w:tcPr>
-          <w:tcW w:w="7063" w:type="dxa"/>
+          <w:tcW w:w="7067" w:type="dxa"/>
           <w:tcBorders>
             <w:top w:val="single" w:sz="4" w:space="0" w:color="000000"/>
             <w:start w:val="single" w:sz="4" w:space="0" w:color="FFFFFF"/>

</xml_diff>